<commit_message>
Document GitHub upload lessons
</commit_message>
<xml_diff>
--- a/docs/公司服务器项目上传 GitHub.docx
+++ b/docs/公司服务器项目上传 GitHub.docx
@@ -1,8 +1,8 @@
 
 <file path=word/document.xml><?xml version="1.0" encoding="utf-8"?>
-<w:document xmlns:wpc="http://schemas.microsoft.com/office/word/2010/wordprocessingCanvas" xmlns:cx="http://schemas.microsoft.com/office/drawing/2014/chartex" xmlns:cx1="http://schemas.microsoft.com/office/drawing/2015/9/8/chartex" xmlns:cx2="http://schemas.microsoft.com/office/drawing/2015/10/21/chartex" xmlns:cx3="http://schemas.microsoft.com/office/drawing/2016/5/9/chartex" xmlns:cx4="http://schemas.microsoft.com/office/drawing/2016/5/10/chartex" xmlns:cx5="http://schemas.microsoft.com/office/drawing/2016/5/11/chartex" xmlns:cx6="http://schemas.microsoft.com/office/drawing/2016/5/12/chartex" xmlns:cx7="http://schemas.microsoft.com/office/drawing/2016/5/13/chartex" xmlns:cx8="http://schemas.microsoft.com/office/drawing/2016/5/14/chartex" xmlns:mc="http://schemas.openxmlformats.org/markup-compatibility/2006" xmlns:o="urn:schemas-microsoft-com:office:office" xmlns:r="http://schemas.openxmlformats.org/officeDocument/2006/relationships" xmlns:m="http://schemas.openxmlformats.org/officeDocument/2006/math" xmlns:v="urn:schemas-microsoft-com:vml" xmlns:wp14="http://schemas.microsoft.com/office/word/2010/wordprocessingDrawing" xmlns:wp="http://schemas.openxmlformats.org/drawingml/2006/wordprocessingDrawing" xmlns:w="http://schemas.openxmlformats.org/wordprocessingml/2006/main" xmlns:w14="http://schemas.microsoft.com/office/word/2010/wordml" xmlns:w10="urn:schemas-microsoft-com:office:word" xmlns:w15="http://schemas.microsoft.com/office/word/2012/wordml" xmlns:wpg="http://schemas.microsoft.com/office/word/2010/wordprocessingGroup" xmlns:wpi="http://schemas.microsoft.com/office/word/2010/wordprocessingInk" xmlns:wne="http://schemas.microsoft.com/office/word/2006/wordml" xmlns:wps="http://schemas.microsoft.com/office/word/2010/wordprocessingShape" xmlns:wpsCustomData="http://www.wps.cn/officeDocument/2013/wpsCustomData" mc:Ignorable="w14 w15 wp14">
+<w:document xmlns:mc="http://schemas.openxmlformats.org/markup-compatibility/2006" xmlns:ns2="http://schemas.microsoft.com/office/word/2010/wordml" xmlns:w="http://schemas.openxmlformats.org/wordprocessingml/2006/main" mc:Ignorable="w14 w15 wp14">
   <w:body>
-    <w:p>
+    <w:p ns2:paraId="7B32F1A1">
       <w:pPr>
         <w:pStyle w:val="2"/>
         <w:keepNext w:val="0"/>
@@ -21,7 +21,7 @@
         <w:t>服务器项目上传 GitHub</w:t>
       </w:r>
     </w:p>
-    <w:p>
+    <w:p ns2:paraId="61669D9B">
       <w:pPr>
         <w:pStyle w:val="3"/>
         <w:keepNext w:val="0"/>
@@ -33,7 +33,7 @@
         <w:t>原理</w:t>
       </w:r>
     </w:p>
-    <w:p>
+    <w:p ns2:paraId="45E43F56">
       <w:pPr>
         <w:pStyle w:val="6"/>
         <w:keepNext w:val="0"/>
@@ -45,7 +45,7 @@
         <w:t>需要分别解决三个问题：</w:t>
       </w:r>
     </w:p>
-    <w:p>
+    <w:p ns2:paraId="7422C909">
       <w:pPr>
         <w:keepNext w:val="0"/>
         <w:keepLines w:val="0"/>
@@ -67,7 +67,7 @@
         <w:t>本地版本。</w:t>
       </w:r>
     </w:p>
-    <w:p>
+    <w:p ns2:paraId="418506BF">
       <w:pPr>
         <w:keepNext w:val="0"/>
         <w:keepLines w:val="0"/>
@@ -84,7 +84,7 @@
         <w:t>SSH 反向代理解决服务器联网问题。</w:t>
       </w:r>
     </w:p>
-    <w:p>
+    <w:p ns2:paraId="44B10C51">
       <w:pPr>
         <w:keepNext w:val="0"/>
         <w:keepLines w:val="0"/>
@@ -101,7 +101,7 @@
         <w:t>Deploy Key 解决 GitHub 写入权限问题。</w:t>
       </w:r>
     </w:p>
-    <w:p>
+    <w:p ns2:paraId="61B67987">
       <w:pPr>
         <w:pStyle w:val="6"/>
         <w:keepNext w:val="0"/>
@@ -113,7 +113,7 @@
         <w:t>网络路径：</w:t>
       </w:r>
     </w:p>
-    <w:p>
+    <w:p ns2:paraId="74CC77B6">
       <w:pPr>
         <w:pStyle w:val="5"/>
         <w:keepNext w:val="0"/>
@@ -132,7 +132,7 @@
         <w:t>服务器 Git</w:t>
       </w:r>
     </w:p>
-    <w:p>
+    <w:p ns2:paraId="362D25FB">
       <w:pPr>
         <w:pStyle w:val="5"/>
         <w:keepNext w:val="0"/>
@@ -151,7 +151,7 @@
         <w:t>→ SSH 反向隧道</w:t>
       </w:r>
     </w:p>
-    <w:p>
+    <w:p ns2:paraId="68D67DB4">
       <w:pPr>
         <w:pStyle w:val="5"/>
         <w:keepNext w:val="0"/>
@@ -170,7 +170,7 @@
         <w:t>→ 本机代理</w:t>
       </w:r>
     </w:p>
-    <w:p>
+    <w:p ns2:paraId="141F64E3">
       <w:pPr>
         <w:pStyle w:val="5"/>
         <w:keepNext w:val="0"/>
@@ -186,7 +186,7 @@
         <w:t>→ GitHub</w:t>
       </w:r>
     </w:p>
-    <w:p>
+    <w:p ns2:paraId="214C154D">
       <w:pPr>
         <w:pStyle w:val="3"/>
         <w:keepNext w:val="0"/>
@@ -198,7 +198,7 @@
         <w:t>前提条件</w:t>
       </w:r>
     </w:p>
-    <w:p>
+    <w:p ns2:paraId="25BEF7DB">
       <w:pPr>
         <w:keepNext w:val="0"/>
         <w:keepLines w:val="0"/>
@@ -215,7 +215,7 @@
         <w:t>本机可以 SSH 登录服务器。</w:t>
       </w:r>
     </w:p>
-    <w:p>
+    <w:p ns2:paraId="72825104">
       <w:pPr>
         <w:keepNext w:val="0"/>
         <w:keepLines w:val="0"/>
@@ -241,7 +241,7 @@
         <w:t>。</w:t>
       </w:r>
     </w:p>
-    <w:p>
+    <w:p ns2:paraId="52C4F055">
       <w:pPr>
         <w:keepNext w:val="0"/>
         <w:keepLines w:val="0"/>
@@ -258,7 +258,7 @@
         <w:t>GitHub 目标仓库已经创建。</w:t>
       </w:r>
     </w:p>
-    <w:p>
+    <w:p ns2:paraId="7F6A6B00">
       <w:pPr>
         <w:keepNext w:val="0"/>
         <w:keepLines w:val="0"/>
@@ -302,7 +302,7 @@
         <w:t>。</w:t>
       </w:r>
     </w:p>
-    <w:p>
+    <w:p ns2:paraId="67031F8F">
       <w:pPr>
         <w:keepNext w:val="0"/>
         <w:keepLines w:val="0"/>
@@ -319,7 +319,7 @@
         <w:t>项目已排除 checkpoint、数据集和大文件。</w:t>
       </w:r>
     </w:p>
-    <w:p>
+    <w:p ns2:paraId="1AB9EEDA">
       <w:pPr>
         <w:pStyle w:val="3"/>
         <w:keepNext w:val="0"/>
@@ -331,7 +331,7 @@
         <w:t>操作步骤</w:t>
       </w:r>
     </w:p>
-    <w:p>
+    <w:p ns2:paraId="389FF6E5">
       <w:pPr>
         <w:pStyle w:val="4"/>
         <w:keepNext w:val="0"/>
@@ -343,7 +343,7 @@
         <w:t>1. 整理项目</w:t>
       </w:r>
     </w:p>
-    <w:p>
+    <w:p ns2:paraId="17C1FE3F">
       <w:pPr>
         <w:pStyle w:val="6"/>
         <w:keepNext w:val="0"/>
@@ -364,7 +364,7 @@
         <w:t>，排除：</w:t>
       </w:r>
     </w:p>
-    <w:p>
+    <w:p ns2:paraId="26F14B7E">
       <w:pPr>
         <w:pStyle w:val="5"/>
         <w:keepNext w:val="0"/>
@@ -383,7 +383,7 @@
         <w:t>**/checkpoint*/</w:t>
       </w:r>
     </w:p>
-    <w:p>
+    <w:p ns2:paraId="7BB217F7">
       <w:pPr>
         <w:pStyle w:val="5"/>
         <w:keepNext w:val="0"/>
@@ -402,7 +402,7 @@
         <w:t>*.pt</w:t>
       </w:r>
     </w:p>
-    <w:p>
+    <w:p ns2:paraId="4695DED6">
       <w:pPr>
         <w:pStyle w:val="5"/>
         <w:keepNext w:val="0"/>
@@ -421,7 +421,7 @@
         <w:t>*.pth</w:t>
       </w:r>
     </w:p>
-    <w:p>
+    <w:p ns2:paraId="374F3360">
       <w:pPr>
         <w:pStyle w:val="5"/>
         <w:keepNext w:val="0"/>
@@ -440,7 +440,7 @@
         <w:t>*.ckpt</w:t>
       </w:r>
     </w:p>
-    <w:p>
+    <w:p ns2:paraId="493E4255">
       <w:pPr>
         <w:pStyle w:val="5"/>
         <w:keepNext w:val="0"/>
@@ -459,7 +459,7 @@
         <w:t>*.safetensors</w:t>
       </w:r>
     </w:p>
-    <w:p>
+    <w:p ns2:paraId="35EA9035">
       <w:pPr>
         <w:pStyle w:val="5"/>
         <w:keepNext w:val="0"/>
@@ -478,7 +478,7 @@
         <w:t>data/</w:t>
       </w:r>
     </w:p>
-    <w:p>
+    <w:p ns2:paraId="17C41B84">
       <w:pPr>
         <w:pStyle w:val="5"/>
         <w:keepNext w:val="0"/>
@@ -497,7 +497,7 @@
         <w:t>pretrained_models/</w:t>
       </w:r>
     </w:p>
-    <w:p>
+    <w:p ns2:paraId="7A8982FD">
       <w:pPr>
         <w:pStyle w:val="5"/>
         <w:keepNext w:val="0"/>
@@ -516,7 +516,7 @@
         <w:t>**/build/</w:t>
       </w:r>
     </w:p>
-    <w:p>
+    <w:p ns2:paraId="2B91222B">
       <w:pPr>
         <w:pStyle w:val="5"/>
         <w:keepNext w:val="0"/>
@@ -532,7 +532,7 @@
         <w:t>*.log</w:t>
       </w:r>
     </w:p>
-    <w:p>
+    <w:p ns2:paraId="6DDD67F9">
       <w:pPr>
         <w:pStyle w:val="6"/>
         <w:keepNext w:val="0"/>
@@ -544,7 +544,7 @@
         <w:t>提交代码：</w:t>
       </w:r>
     </w:p>
-    <w:p>
+    <w:p ns2:paraId="2DBC6588">
       <w:pPr>
         <w:pStyle w:val="5"/>
         <w:keepNext w:val="0"/>
@@ -563,7 +563,7 @@
         <w:t>git add -A</w:t>
       </w:r>
     </w:p>
-    <w:p>
+    <w:p ns2:paraId="1DF6BF2D">
       <w:pPr>
         <w:pStyle w:val="5"/>
         <w:keepNext w:val="0"/>
@@ -579,7 +579,7 @@
         <w:t>git commit -m "Backup project"</w:t>
       </w:r>
     </w:p>
-    <w:p>
+    <w:p ns2:paraId="33A92946">
       <w:pPr>
         <w:pStyle w:val="6"/>
         <w:keepNext w:val="0"/>
@@ -600,7 +600,7 @@
         <w:t xml:space="preserve"> 只保存本地版本。它不会上传到 GitHub。</w:t>
       </w:r>
     </w:p>
-    <w:p>
+    <w:p ns2:paraId="74F19C18">
       <w:pPr>
         <w:pStyle w:val="4"/>
         <w:keepNext w:val="0"/>
@@ -612,7 +612,7 @@
         <w:t>2. 建立反向代理</w:t>
       </w:r>
     </w:p>
-    <w:p>
+    <w:p ns2:paraId="79843B8C">
       <w:pPr>
         <w:pStyle w:val="6"/>
         <w:keepNext w:val="0"/>
@@ -624,7 +624,7 @@
         <w:t>在本机执行：</w:t>
       </w:r>
     </w:p>
-    <w:p>
+    <w:p ns2:paraId="789DC74C">
       <w:pPr>
         <w:pStyle w:val="5"/>
         <w:keepNext w:val="0"/>
@@ -643,7 +643,7 @@
         <w:t>ssh -N \</w:t>
       </w:r>
     </w:p>
-    <w:p>
+    <w:p ns2:paraId="1D185648">
       <w:pPr>
         <w:pStyle w:val="5"/>
         <w:keepNext w:val="0"/>
@@ -662,7 +662,7 @@
         <w:t xml:space="preserve">  -R 127.0.0.1:17890:127.0.0.1:7890 \</w:t>
       </w:r>
     </w:p>
-    <w:p>
+    <w:p ns2:paraId="28C3D320">
       <w:pPr>
         <w:pStyle w:val="5"/>
         <w:keepNext w:val="0"/>
@@ -678,7 +678,7 @@
         <w:t xml:space="preserve">  服务器别名</w:t>
       </w:r>
     </w:p>
-    <w:p>
+    <w:p ns2:paraId="1D0B8B54">
       <w:pPr>
         <w:pStyle w:val="6"/>
         <w:keepNext w:val="0"/>
@@ -690,7 +690,7 @@
         <w:t>保持该命令运行。</w:t>
       </w:r>
     </w:p>
-    <w:p>
+    <w:p ns2:paraId="409B5891">
       <w:pPr>
         <w:pStyle w:val="6"/>
         <w:keepNext w:val="0"/>
@@ -711,7 +711,7 @@
         <w:t xml:space="preserve"> 使用本机代理。</w:t>
       </w:r>
     </w:p>
-    <w:p>
+    <w:p ns2:paraId="761406F8">
       <w:pPr>
         <w:pStyle w:val="4"/>
         <w:keepNext w:val="0"/>
@@ -723,7 +723,7 @@
         <w:t>3. 创建 Deploy Key</w:t>
       </w:r>
     </w:p>
-    <w:p>
+    <w:p ns2:paraId="2082F2CE">
       <w:pPr>
         <w:pStyle w:val="6"/>
         <w:keepNext w:val="0"/>
@@ -735,7 +735,7 @@
         <w:t>在服务器执行：</w:t>
       </w:r>
     </w:p>
-    <w:p>
+    <w:p ns2:paraId="54B2CD26">
       <w:pPr>
         <w:pStyle w:val="5"/>
         <w:keepNext w:val="0"/>
@@ -751,7 +751,7 @@
         <w:t>ssh-keygen -t ed25519 -N "" -f ~/.ssh/github_deploy_key</w:t>
       </w:r>
     </w:p>
-    <w:p>
+    <w:p ns2:paraId="015D6356">
       <w:pPr>
         <w:pStyle w:val="6"/>
         <w:keepNext w:val="0"/>
@@ -763,7 +763,7 @@
         <w:t>复制公钥：</w:t>
       </w:r>
     </w:p>
-    <w:p>
+    <w:p ns2:paraId="3BE072C7">
       <w:pPr>
         <w:pStyle w:val="5"/>
         <w:keepNext w:val="0"/>
@@ -779,7 +779,7 @@
         <w:t>cat ~/.ssh/github_deploy_key.pub</w:t>
       </w:r>
     </w:p>
-    <w:p>
+    <w:p ns2:paraId="13FBDDAE">
       <w:pPr>
         <w:pStyle w:val="6"/>
         <w:keepNext w:val="0"/>
@@ -791,7 +791,7 @@
         <w:t>在 GitHub 仓库中打开：</w:t>
       </w:r>
     </w:p>
-    <w:p>
+    <w:p ns2:paraId="050D5E8C">
       <w:pPr>
         <w:pStyle w:val="5"/>
         <w:keepNext w:val="0"/>
@@ -807,7 +807,7 @@
         <w:t>Settings → Deploy keys → Add deploy key</w:t>
       </w:r>
     </w:p>
-    <w:p>
+    <w:p ns2:paraId="0DC2026E">
       <w:pPr>
         <w:pStyle w:val="6"/>
         <w:keepNext w:val="0"/>
@@ -819,7 +819,7 @@
         <w:t>添加公钥，并勾选：</w:t>
       </w:r>
     </w:p>
-    <w:p>
+    <w:p ns2:paraId="2E1C2DC1">
       <w:pPr>
         <w:pStyle w:val="5"/>
         <w:keepNext w:val="0"/>
@@ -835,7 +835,7 @@
         <w:t>Allow write access</w:t>
       </w:r>
     </w:p>
-    <w:p>
+    <w:p ns2:paraId="65EA0BFC">
       <w:pPr>
         <w:pStyle w:val="6"/>
         <w:keepNext w:val="0"/>
@@ -847,7 +847,7 @@
         <w:t>不要上传或公开私钥。</w:t>
       </w:r>
     </w:p>
-    <w:p>
+    <w:p ns2:paraId="72E8F2D1">
       <w:pPr>
         <w:pStyle w:val="4"/>
         <w:keepNext w:val="0"/>
@@ -859,7 +859,7 @@
         <w:t>4. 添加 GitHub 远端</w:t>
       </w:r>
     </w:p>
-    <w:p>
+    <w:p ns2:paraId="75F0E18A">
       <w:pPr>
         <w:pStyle w:val="6"/>
         <w:keepNext w:val="0"/>
@@ -880,7 +880,7 @@
         <w:t>。</w:t>
       </w:r>
     </w:p>
-    <w:p>
+    <w:p ns2:paraId="77FF3B3B">
       <w:pPr>
         <w:pStyle w:val="6"/>
         <w:keepNext w:val="0"/>
@@ -901,7 +901,7 @@
         <w:t>：</w:t>
       </w:r>
     </w:p>
-    <w:p>
+    <w:p ns2:paraId="70C51F90">
       <w:pPr>
         <w:pStyle w:val="5"/>
         <w:keepNext w:val="0"/>
@@ -920,7 +920,7 @@
         <w:t>git remote add backup \</w:t>
       </w:r>
     </w:p>
-    <w:p>
+    <w:p ns2:paraId="15125AD0">
       <w:pPr>
         <w:pStyle w:val="5"/>
         <w:keepNext w:val="0"/>
@@ -936,7 +936,7 @@
         <w:t xml:space="preserve">  ssh://git@ssh.github.com:443/用户名/仓库名.git</w:t>
       </w:r>
     </w:p>
-    <w:p>
+    <w:p ns2:paraId="2AE96797">
       <w:pPr>
         <w:pStyle w:val="4"/>
         <w:keepNext w:val="0"/>
@@ -948,7 +948,7 @@
         <w:t>5. 配置 Git 使用代理</w:t>
       </w:r>
     </w:p>
-    <w:p>
+    <w:p ns2:paraId="793BA2E9">
       <w:pPr>
         <w:pStyle w:val="6"/>
         <w:keepNext w:val="0"/>
@@ -960,7 +960,7 @@
         <w:t>在服务器执行：</w:t>
       </w:r>
     </w:p>
-    <w:p>
+    <w:p ns2:paraId="30B90C3E">
       <w:pPr>
         <w:pStyle w:val="5"/>
         <w:keepNext w:val="0"/>
@@ -979,7 +979,7 @@
         <w:t>export GIT_SSH_COMMAND="ssh \</w:t>
       </w:r>
     </w:p>
-    <w:p>
+    <w:p ns2:paraId="7A9358A9">
       <w:pPr>
         <w:pStyle w:val="5"/>
         <w:keepNext w:val="0"/>
@@ -998,7 +998,7 @@
         <w:t>-i ~/.ssh/github_deploy_key \</w:t>
       </w:r>
     </w:p>
-    <w:p>
+    <w:p ns2:paraId="241731D6">
       <w:pPr>
         <w:pStyle w:val="5"/>
         <w:keepNext w:val="0"/>
@@ -1017,7 +1017,7 @@
         <w:t>-o IdentitiesOnly=yes \</w:t>
       </w:r>
     </w:p>
-    <w:p>
+    <w:p ns2:paraId="337C351E">
       <w:pPr>
         <w:pStyle w:val="5"/>
         <w:keepNext w:val="0"/>
@@ -1033,7 +1033,7 @@
         <w:t>-o ProxyCommand=\"nc -X connect -x 127.0.0.1:17890 %h %p\""</w:t>
       </w:r>
     </w:p>
-    <w:p>
+    <w:p ns2:paraId="4E07D34F">
       <w:pPr>
         <w:pStyle w:val="6"/>
         <w:keepNext w:val="0"/>
@@ -1045,7 +1045,7 @@
         <w:t>测试连接：</w:t>
       </w:r>
     </w:p>
-    <w:p>
+    <w:p ns2:paraId="0B8FB62E">
       <w:pPr>
         <w:pStyle w:val="5"/>
         <w:keepNext w:val="0"/>
@@ -1061,7 +1061,7 @@
         <w:t>git ls-remote backup</w:t>
       </w:r>
     </w:p>
-    <w:p>
+    <w:p ns2:paraId="2919805E">
       <w:pPr>
         <w:pStyle w:val="4"/>
         <w:keepNext w:val="0"/>
@@ -1073,7 +1073,7 @@
         <w:t>6. 上传并验证</w:t>
       </w:r>
     </w:p>
-    <w:p>
+    <w:p ns2:paraId="3650476C">
       <w:pPr>
         <w:pStyle w:val="6"/>
         <w:keepNext w:val="0"/>
@@ -1085,7 +1085,7 @@
         <w:t>上传：</w:t>
       </w:r>
     </w:p>
-    <w:p>
+    <w:p ns2:paraId="37787EFE">
       <w:pPr>
         <w:pStyle w:val="5"/>
         <w:keepNext w:val="0"/>
@@ -1101,7 +1101,7 @@
         <w:t>git push -u backup main</w:t>
       </w:r>
     </w:p>
-    <w:p>
+    <w:p ns2:paraId="146FDD97">
       <w:pPr>
         <w:pStyle w:val="6"/>
         <w:keepNext w:val="0"/>
@@ -1113,7 +1113,7 @@
         <w:t>验证：</w:t>
       </w:r>
     </w:p>
-    <w:p>
+    <w:p ns2:paraId="2DF4FE69">
       <w:pPr>
         <w:pStyle w:val="5"/>
         <w:keepNext w:val="0"/>
@@ -1132,7 +1132,7 @@
         <w:t>git rev-parse HEAD</w:t>
       </w:r>
     </w:p>
-    <w:p>
+    <w:p ns2:paraId="4BF5A5FF">
       <w:pPr>
         <w:pStyle w:val="5"/>
         <w:keepNext w:val="0"/>
@@ -1148,7 +1148,7 @@
         <w:t>git ls-remote backup refs/heads/main</w:t>
       </w:r>
     </w:p>
-    <w:p>
+    <w:p ns2:paraId="6A6CB032">
       <w:pPr>
         <w:pStyle w:val="6"/>
         <w:keepNext w:val="0"/>
@@ -1160,7 +1160,7 @@
         <w:t>两个提交哈希相同，表示上传成功。</w:t>
       </w:r>
     </w:p>
-    <w:p>
+    <w:p ns2:paraId="2CE58A5D">
       <w:pPr>
         <w:pStyle w:val="3"/>
         <w:keepNext w:val="0"/>
@@ -1172,7 +1172,7 @@
         <w:t>关键经验</w:t>
       </w:r>
     </w:p>
-    <w:p>
+    <w:p ns2:paraId="0AAB9934">
       <w:pPr>
         <w:keepNext w:val="0"/>
         <w:keepLines w:val="0"/>
@@ -1195,7 +1195,7 @@
         <w:t xml:space="preserve"> 是本地保存。</w:t>
       </w:r>
     </w:p>
-    <w:p>
+    <w:p ns2:paraId="41B5E938">
       <w:pPr>
         <w:keepNext w:val="0"/>
         <w:keepLines w:val="0"/>
@@ -1218,7 +1218,7 @@
         <w:t xml:space="preserve"> 才是上传。</w:t>
       </w:r>
     </w:p>
-    <w:p>
+    <w:p ns2:paraId="62EBCCCC">
       <w:pPr>
         <w:keepNext w:val="0"/>
         <w:keepLines w:val="0"/>
@@ -1235,7 +1235,7 @@
         <w:t>反向代理解决网络问题。</w:t>
       </w:r>
     </w:p>
-    <w:p>
+    <w:p ns2:paraId="65B2B526">
       <w:pPr>
         <w:keepNext w:val="0"/>
         <w:keepLines w:val="0"/>
@@ -1252,7 +1252,7 @@
         <w:t>Deploy Key 解决权限问题。</w:t>
       </w:r>
     </w:p>
-    <w:p>
+    <w:p ns2:paraId="1B1CF517">
       <w:pPr>
         <w:keepNext w:val="0"/>
         <w:keepLines w:val="0"/>
@@ -1287,7 +1287,7 @@
         <w:t>。</w:t>
       </w:r>
     </w:p>
-    <w:p>
+    <w:p ns2:paraId="5329CDE2">
       <w:pPr>
         <w:keepNext w:val="0"/>
         <w:keepLines w:val="0"/>
@@ -1304,7 +1304,7 @@
         <w:t>上传前必须排除权重、大文件和敏感信息。</w:t>
       </w:r>
     </w:p>
-    <w:p>
+    <w:p ns2:paraId="2F230AFC">
       <w:pPr>
         <w:keepNext w:val="0"/>
         <w:keepLines w:val="0"/>
@@ -1330,7 +1330,50 @@
         <w:t>。</w:t>
       </w:r>
     </w:p>
-    <w:p/>
+    <w:p ns2:paraId="732F5DD9"/>
+    <w:p>
+      <w:pPr>
+        <w:pStyle w:val="3"/>
+      </w:pPr>
+      <w:r>
+        <w:t>本次实际上传经验（2026-10）</w:t>
+      </w:r>
+    </w:p>
+    <w:p>
+      <w:r>
+        <w:t>1. 先检查 git status、git remote 和 .git 内容。仅有空的 .git/logs 或 .git/refs 目录不代表仓库有可用历史；需要执行 git init，并核对首个 commit。</w:t>
+      </w:r>
+    </w:p>
+    <w:p>
+      <w:r>
+        <w:t>2. 服务器项目通常包含几十 GB 的实验产物。提交前应按项目实际情况加入 .gitignore，例如 artifacts/、results/、logs/、wandb/、数据集、预训练模型、checkpoint、*.pt、*.pth、*.ckpt、*.safetensors、*.npz、*.npy、视频和 Python 缓存。</w:t>
+      </w:r>
+    </w:p>
+    <w:p>
+      <w:r>
+        <w:t>3. 使用 git diff --cached --name-only 和文件大小检查确认暂存区没有大文件、权重或敏感信息，再执行 git commit。上传的是源码、配置、测试和文档快照。</w:t>
+      </w:r>
+    </w:p>
+    <w:p>
+      <w:r>
+        <w:t>4. 服务器可通过已存在的 HTTP 代理连接 GitHub 时，可以使用 ProxyCommand：nc -X connect -x 127.0.0.1:17897 %h %p，并将它写入 GIT_SSH_COMMAND。代理端口以服务器当前环境为准，不要固定套用其他机器的端口。</w:t>
+      </w:r>
+    </w:p>
+    <w:p>
+      <w:r>
+        <w:t>5. 如果 git ls-remote 发现远端已经有 Initial commit，直接 git push 会被拒绝。先 fetch 远端并保留其历史；若本地工作树有权限受限的运行日志，避免强行覆盖这些文件。可用当前本地树创建双父合并提交，再推送 main：git commit-tree &lt;本地树&gt; -p &lt;本地提交&gt; -p &lt;远端提交&gt;。</w:t>
+      </w:r>
+    </w:p>
+    <w:p>
+      <w:r>
+        <w:t>6. 合并或失败的 checkout 可能把远端文件留下为未跟踪文件。清理前先用 git clean -nd 预览，只删除明确由本次操作产生的未跟踪文件；不要使用 -x，以免删除被 .gitignore 排除的实验数据、日志或缓存。</w:t>
+      </w:r>
+    </w:p>
+    <w:p>
+      <w:r>
+        <w:t>7. 上传完成后必须比较本地和远端哈希：git rev-parse HEAD，以及 git ls-remote backup refs/heads/main。两者一致且 git status 显示工作区干净，才算完成。</w:t>
+      </w:r>
+    </w:p>
     <w:sectPr>
       <w:pgSz w:w="11906" w:h="16838"/>
       <w:pgMar w:top="1440" w:right="1800" w:bottom="1440" w:left="1800" w:header="851" w:footer="992" w:gutter="0"/>

</xml_diff>